<commit_message>
add dashboard screenshots to the report
</commit_message>
<xml_diff>
--- a/report.docx
+++ b/report.docx
@@ -2,7 +2,7 @@
 <file path=word/document.xml><?xml version="1.0" encoding="utf-8"?>
 <w:document xmlns:w="http://schemas.openxmlformats.org/wordprocessingml/2006/main" xmlns:m="http://schemas.openxmlformats.org/officeDocument/2006/math" xmlns:r="http://schemas.openxmlformats.org/officeDocument/2006/relationships" xmlns:o="urn:schemas-microsoft-com:office:office" xmlns:v="urn:schemas-microsoft-com:vml" xmlns:w10="urn:schemas-microsoft-com:office:word" xmlns:a="http://schemas.openxmlformats.org/drawingml/2006/main" xmlns:pic="http://schemas.openxmlformats.org/drawingml/2006/picture" xmlns:wp="http://schemas.openxmlformats.org/drawingml/2006/wordprocessingDrawing">
   <w:body>
-    <w:bookmarkStart w:id="52" w:name="Xfacc2b2710e74fab4a4ea4c0d88e90186216865"/>
+    <w:bookmarkStart w:id="68" w:name="Xfacc2b2710e74fab4a4ea4c0d88e90186216865"/>
     <w:p>
       <w:pPr>
         <w:pStyle w:val="Heading1"/>
@@ -5783,7 +5783,7 @@
       </w:r>
     </w:p>
     <w:bookmarkEnd w:id="45"/>
-    <w:bookmarkStart w:id="51" w:name="appendix"/>
+    <w:bookmarkStart w:id="67" w:name="appendix"/>
     <w:p>
       <w:pPr>
         <w:pStyle w:val="Heading2"/>
@@ -5928,7 +5928,7 @@
       </w:hyperlink>
     </w:p>
     <w:bookmarkEnd w:id="49"/>
-    <w:bookmarkStart w:id="50" w:name="screenshots"/>
+    <w:bookmarkStart w:id="66" w:name="screenshots"/>
     <w:p>
       <w:pPr>
         <w:pStyle w:val="Heading3"/>
@@ -5942,56 +5942,254 @@
         <w:pStyle w:val="FirstParagraph"/>
       </w:pPr>
       <w:r>
-        <w:t xml:space="preserve">Phone screenshots to be added here.</w:t>
-      </w:r>
-    </w:p>
-    <w:p>
-      <w:pPr>
-        <w:pStyle w:val="BodyText"/>
-      </w:pPr>
-      <w:r>
-        <w:t xml:space="preserve">[screenshot: dashboard - the</w:t>
+        <w:t xml:space="preserve">Four views of the live dashboard at</w:t>
       </w:r>
       <w:r>
         <w:t xml:space="preserve"> </w:t>
       </w:r>
-      <w:r>
-        <w:t xml:space="preserve">“How it works”</w:t>
-      </w:r>
-      <w:r>
-        <w:t xml:space="preserve"> </w:t>
-      </w:r>
-      <w:r>
-        <w:t xml:space="preserve">tab on a phone]</w:t>
-      </w:r>
-    </w:p>
-    <w:p>
-      <w:pPr>
-        <w:pStyle w:val="BodyText"/>
-      </w:pPr>
-      <w:r>
-        <w:t xml:space="preserve">[screenshot: dashboard - Compare view, the two strategy maps stacked]</w:t>
-      </w:r>
-    </w:p>
-    <w:p>
-      <w:pPr>
-        <w:pStyle w:val="BodyText"/>
-      </w:pPr>
-      <w:r>
-        <w:t xml:space="preserve">[screenshot: dashboard - live metrics, request queue and collection history]</w:t>
-      </w:r>
-    </w:p>
-    <w:p>
-      <w:pPr>
-        <w:pStyle w:val="BodyText"/>
-      </w:pPr>
-      <w:r>
-        <w:t xml:space="preserve">[screenshot: dashboard - Results tab with the load sweep charts]</w:t>
-      </w:r>
-    </w:p>
-    <w:bookmarkEnd w:id="50"/>
-    <w:bookmarkEnd w:id="51"/>
-    <w:bookmarkEnd w:id="52"/>
+      <w:hyperlink r:id="rId47">
+        <w:r>
+          <w:rPr>
+            <w:rStyle w:val="Hyperlink"/>
+          </w:rPr>
+          <w:t xml:space="preserve">https://smartbinn.streamlit.app/</w:t>
+        </w:r>
+      </w:hyperlink>
+      <w:r>
+        <w:t xml:space="preserve">.</w:t>
+      </w:r>
+    </w:p>
+    <w:bookmarkStart w:id="53" w:name="fig:shot-smart"/>
+    <w:p>
+      <w:pPr>
+        <w:pStyle w:val="CaptionedFigure"/>
+      </w:pPr>
+      <w:r>
+        <w:drawing>
+          <wp:inline>
+            <wp:extent cx="5334000" cy="5334000"/>
+            <wp:effectExtent b="0" l="0" r="0" t="0"/>
+            <wp:docPr descr="The Simulation tab in the Smart view: bins coloured and marked by state, the legend under the grid naming every state, and truck 2 parked on the outlined depot at the start of the day." title="" id="51" name="Picture"/>
+            <a:graphic>
+              <a:graphicData uri="http://schemas.openxmlformats.org/drawingml/2006/picture">
+                <pic:pic>
+                  <pic:nvPicPr>
+                    <pic:cNvPr descr="screenshots/Screenshot_20261015_080240_Mises.png" id="52" name="Picture"/>
+                    <pic:cNvPicPr>
+                      <a:picLocks noChangeArrowheads="1" noChangeAspect="1"/>
+                    </pic:cNvPicPr>
+                  </pic:nvPicPr>
+                  <pic:blipFill>
+                    <a:blip r:embed="rId50"/>
+                    <a:stretch>
+                      <a:fillRect/>
+                    </a:stretch>
+                  </pic:blipFill>
+                  <pic:spPr bwMode="auto">
+                    <a:xfrm>
+                      <a:off x="0" y="0"/>
+                      <a:ext cx="5334000" cy="5334000"/>
+                    </a:xfrm>
+                    <a:prstGeom prst="rect">
+                      <a:avLst/>
+                    </a:prstGeom>
+                    <a:noFill/>
+                    <a:ln w="9525">
+                      <a:noFill/>
+                      <a:headEnd/>
+                      <a:tailEnd/>
+                    </a:ln>
+                  </pic:spPr>
+                </pic:pic>
+              </a:graphicData>
+            </a:graphic>
+          </wp:inline>
+        </w:drawing>
+      </w:r>
+    </w:p>
+    <w:p>
+      <w:pPr>
+        <w:pStyle w:val="ImageCaption"/>
+      </w:pPr>
+      <w:r>
+        <w:t xml:space="preserve">The Simulation tab in the Smart view: bins coloured and marked by state, the legend under the grid naming every state, and truck 2 parked on the outlined depot at the start of the day.</w:t>
+      </w:r>
+    </w:p>
+    <w:bookmarkEnd w:id="53"/>
+    <w:bookmarkStart w:id="57" w:name="fig:shot-baseline"/>
+    <w:p>
+      <w:pPr>
+        <w:pStyle w:val="CaptionedFigure"/>
+      </w:pPr>
+      <w:r>
+        <w:drawing>
+          <wp:inline>
+            <wp:extent cx="5334000" cy="5326591"/>
+            <wp:effectExtent b="0" l="0" r="0" t="0"/>
+            <wp:docPr descr="The same city at the same step under the Baseline strategy. Only the truck differs: truck 3 sits on the depot, because the baseline follows a fixed route rather than answering requests." title="" id="55" name="Picture"/>
+            <a:graphic>
+              <a:graphicData uri="http://schemas.openxmlformats.org/drawingml/2006/picture">
+                <pic:pic>
+                  <pic:nvPicPr>
+                    <pic:cNvPr descr="screenshots/Screenshot_20261015_080252_Mises.png" id="56" name="Picture"/>
+                    <pic:cNvPicPr>
+                      <a:picLocks noChangeArrowheads="1" noChangeAspect="1"/>
+                    </pic:cNvPicPr>
+                  </pic:nvPicPr>
+                  <pic:blipFill>
+                    <a:blip r:embed="rId54"/>
+                    <a:stretch>
+                      <a:fillRect/>
+                    </a:stretch>
+                  </pic:blipFill>
+                  <pic:spPr bwMode="auto">
+                    <a:xfrm>
+                      <a:off x="0" y="0"/>
+                      <a:ext cx="5334000" cy="5326591"/>
+                    </a:xfrm>
+                    <a:prstGeom prst="rect">
+                      <a:avLst/>
+                    </a:prstGeom>
+                    <a:noFill/>
+                    <a:ln w="9525">
+                      <a:noFill/>
+                      <a:headEnd/>
+                      <a:tailEnd/>
+                    </a:ln>
+                  </pic:spPr>
+                </pic:pic>
+              </a:graphicData>
+            </a:graphic>
+          </wp:inline>
+        </w:drawing>
+      </w:r>
+    </w:p>
+    <w:p>
+      <w:pPr>
+        <w:pStyle w:val="ImageCaption"/>
+      </w:pPr>
+      <w:r>
+        <w:t xml:space="preserve">The same city at the same step under the Baseline strategy. Only the truck differs: truck 3 sits on the depot, because the baseline follows a fixed route rather than answering requests.</w:t>
+      </w:r>
+    </w:p>
+    <w:bookmarkEnd w:id="57"/>
+    <w:bookmarkStart w:id="61" w:name="fig:shot-tables"/>
+    <w:p>
+      <w:pPr>
+        <w:pStyle w:val="CaptionedFigure"/>
+      </w:pPr>
+      <w:r>
+        <w:drawing>
+          <wp:inline>
+            <wp:extent cx="5334000" cy="4133850"/>
+            <wp:effectExtent b="0" l="0" r="0" t="0"/>
+            <wp:docPr descr="The tables below the map at step 0: the five headline metrics all read zero, the fill levels are listed fullest first, and the request queue and collection history show their empty states." title="" id="59" name="Picture"/>
+            <a:graphic>
+              <a:graphicData uri="http://schemas.openxmlformats.org/drawingml/2006/picture">
+                <pic:pic>
+                  <pic:nvPicPr>
+                    <pic:cNvPr descr="screenshots/Screenshot_20261015_080301_Mises.png" id="60" name="Picture"/>
+                    <pic:cNvPicPr>
+                      <a:picLocks noChangeArrowheads="1" noChangeAspect="1"/>
+                    </pic:cNvPicPr>
+                  </pic:nvPicPr>
+                  <pic:blipFill>
+                    <a:blip r:embed="rId58"/>
+                    <a:stretch>
+                      <a:fillRect/>
+                    </a:stretch>
+                  </pic:blipFill>
+                  <pic:spPr bwMode="auto">
+                    <a:xfrm>
+                      <a:off x="0" y="0"/>
+                      <a:ext cx="5334000" cy="4133850"/>
+                    </a:xfrm>
+                    <a:prstGeom prst="rect">
+                      <a:avLst/>
+                    </a:prstGeom>
+                    <a:noFill/>
+                    <a:ln w="9525">
+                      <a:noFill/>
+                      <a:headEnd/>
+                      <a:tailEnd/>
+                    </a:ln>
+                  </pic:spPr>
+                </pic:pic>
+              </a:graphicData>
+            </a:graphic>
+          </wp:inline>
+        </w:drawing>
+      </w:r>
+    </w:p>
+    <w:p>
+      <w:pPr>
+        <w:pStyle w:val="ImageCaption"/>
+      </w:pPr>
+      <w:r>
+        <w:t xml:space="preserve">The tables below the map at step 0: the five headline metrics all read zero, the fill levels are listed fullest first, and the request queue and collection history show their empty states.</w:t>
+      </w:r>
+    </w:p>
+    <w:bookmarkEnd w:id="61"/>
+    <w:bookmarkStart w:id="65" w:name="fig:shot-results"/>
+    <w:p>
+      <w:pPr>
+        <w:pStyle w:val="CaptionedFigure"/>
+      </w:pPr>
+      <w:r>
+        <w:drawing>
+          <wp:inline>
+            <wp:extent cx="5334000" cy="5463645"/>
+            <wp:effectExtent b="0" l="0" r="0" t="0"/>
+            <wp:docPr descr="The Results tab with the overflow-episode chart: the dispatcher is clean up to the 130 % level and above the fixed route beyond it, with the duration sweep and the transient note in the collapsed panels below." title="" id="63" name="Picture"/>
+            <a:graphic>
+              <a:graphicData uri="http://schemas.openxmlformats.org/drawingml/2006/picture">
+                <pic:pic>
+                  <pic:nvPicPr>
+                    <pic:cNvPr descr="screenshots/Screenshot_20261015_080311_Mises.png" id="64" name="Picture"/>
+                    <pic:cNvPicPr>
+                      <a:picLocks noChangeArrowheads="1" noChangeAspect="1"/>
+                    </pic:cNvPicPr>
+                  </pic:nvPicPr>
+                  <pic:blipFill>
+                    <a:blip r:embed="rId62"/>
+                    <a:stretch>
+                      <a:fillRect/>
+                    </a:stretch>
+                  </pic:blipFill>
+                  <pic:spPr bwMode="auto">
+                    <a:xfrm>
+                      <a:off x="0" y="0"/>
+                      <a:ext cx="5334000" cy="5463645"/>
+                    </a:xfrm>
+                    <a:prstGeom prst="rect">
+                      <a:avLst/>
+                    </a:prstGeom>
+                    <a:noFill/>
+                    <a:ln w="9525">
+                      <a:noFill/>
+                      <a:headEnd/>
+                      <a:tailEnd/>
+                    </a:ln>
+                  </pic:spPr>
+                </pic:pic>
+              </a:graphicData>
+            </a:graphic>
+          </wp:inline>
+        </w:drawing>
+      </w:r>
+    </w:p>
+    <w:p>
+      <w:pPr>
+        <w:pStyle w:val="ImageCaption"/>
+      </w:pPr>
+      <w:r>
+        <w:t xml:space="preserve">The Results tab with the overflow-episode chart: the dispatcher is clean up to the 130 % level and above the fixed route beyond it, with the duration sweep and the transient note in the collapsed panels below.</w:t>
+      </w:r>
+    </w:p>
+    <w:bookmarkEnd w:id="65"/>
+    <w:bookmarkEnd w:id="66"/>
+    <w:bookmarkEnd w:id="67"/>
+    <w:bookmarkEnd w:id="68"/>
     <w:sectPr>
       <w:footnotePr>
         <w:numRestart w:val="eachSect"/>

</xml_diff>

<commit_message>
retitle the report and scope the optimization as dispatch, not routing
</commit_message>
<xml_diff>
--- a/report.docx
+++ b/report.docx
@@ -2,13 +2,13 @@
 <file path=word/document.xml><?xml version="1.0" encoding="utf-8"?>
 <w:document xmlns:w="http://schemas.openxmlformats.org/wordprocessingml/2006/main" xmlns:m="http://schemas.openxmlformats.org/officeDocument/2006/math" xmlns:r="http://schemas.openxmlformats.org/officeDocument/2006/relationships" xmlns:o="urn:schemas-microsoft-com:office:office" xmlns:v="urn:schemas-microsoft-com:vml" xmlns:w10="urn:schemas-microsoft-com:office:word" xmlns:a="http://schemas.openxmlformats.org/drawingml/2006/main" xmlns:pic="http://schemas.openxmlformats.org/drawingml/2006/picture" xmlns:wp="http://schemas.openxmlformats.org/drawingml/2006/wordprocessingDrawing">
   <w:body>
-    <w:bookmarkStart w:id="68" w:name="Xfacc2b2710e74fab4a4ea4c0d88e90186216865"/>
+    <w:bookmarkStart w:id="69" w:name="X3164a7633e04a7f1ef818e4b3bba633e474a2ac"/>
     <w:p>
       <w:pPr>
         <w:pStyle w:val="Heading1"/>
       </w:pPr>
       <w:r>
-        <w:t xml:space="preserve">Design and Implementation of an Agent-Based Smart Waste Bin Management System</w:t>
+        <w:t xml:space="preserve">Agent-Based Smart Waste Collection and Route Optimization System</w:t>
       </w:r>
     </w:p>
     <w:bookmarkStart w:id="9" w:name="abstract"/>
@@ -25,11 +25,11 @@
         <w:pStyle w:val="FirstParagraph"/>
       </w:pPr>
       <w:r>
-        <w:t xml:space="preserve">This project builds an agent-based simulation of urban waste collection in Python with Mesa 3. Two collection strategies run on identical pre-generated scenarios: a fixed route each truck drives, and a dispatcher that sends the nearest free truck to the fullest bin. Thirty bins, three trucks and one central depot fill and empty over repeated days at seven load levels. Staged checks on single agents, and two identities asserted on every run, verify the behaviour; one is a mass balance proving no waste is lost or created. Over one day at 40 to 130 percent of a never-idle capacity estimate, the dispatcher produces no overflow, drives about half as far as the fixed route and cuts waiting fivefold. Over six days at 130 percent it overflows more often. A live dashboard steps through both strategies side by side.</w:t>
+        <w:t xml:space="preserve">This project builds an agent-based simulation of urban waste collection in Python with Mesa 3 and tests dispatch optimization against a fixed-route baseline: which bin is served, by which truck, and in what order. Thirty bins, three trucks and one central depot fill and empty over repeated days at seven load levels. Staged checks on single agents, and two identities asserted on every run, verify the behaviour; one is a mass balance proving no waste is lost or created. Over one day at 40 to 130 percent of a never-idle capacity estimate, the dispatcher produces no overflow, drives about half as far as the fixed route and cuts waiting fivefold. Over six days at 130 percent it overflows more often. A live dashboard steps through both strategies side by side.</w:t>
       </w:r>
     </w:p>
     <w:bookmarkEnd w:id="9"/>
-    <w:bookmarkStart w:id="10" w:name="introduction"/>
+    <w:bookmarkStart w:id="11" w:name="introduction"/>
     <w:p>
       <w:pPr>
         <w:pStyle w:val="Heading2"/>
@@ -54,14 +54,13 @@
         <w:t xml:space="preserve">The objective is to build a simulation in which the effect of that decision can be measured rather than argued about. The system contains 30 waste bins on a 20 by 20 grid, three collection trucks and one depot. Two strategies are compared on exactly the same waste, in exactly the same order, over the same days: a baseline in which each truck follows a fixed round through the city and empties whatever it finds, and a smart strategy in which a central dispatcher sends the nearest free truck to whichever bin needs emptying most. The project asks which strategy wastes less, which serves people faster, and under what conditions each one fails.</w:t>
       </w:r>
     </w:p>
-    <w:bookmarkEnd w:id="10"/>
-    <w:bookmarkStart w:id="11" w:name="background"/>
-    <w:p>
-      <w:pPr>
-        <w:pStyle w:val="Heading2"/>
-      </w:pPr>
-      <w:r>
-        <w:t xml:space="preserve">2. Background</w:t>
+    <w:bookmarkStart w:id="10" w:name="scope-of-route-optimization"/>
+    <w:p>
+      <w:pPr>
+        <w:pStyle w:val="Heading3"/>
+      </w:pPr>
+      <w:r>
+        <w:t xml:space="preserve">Scope of route optimization</w:t>
       </w:r>
     </w:p>
     <w:p>
@@ -69,7 +68,7 @@
         <w:pStyle w:val="FirstParagraph"/>
       </w:pPr>
       <w:r>
-        <w:t xml:space="preserve">An</w:t>
+        <w:t xml:space="preserve">The optimization tested here is</w:t>
       </w:r>
       <w:r>
         <w:t xml:space="preserve"> </w:t>
@@ -79,13 +78,10 @@
           <w:b/>
           <w:bCs/>
         </w:rPr>
-        <w:t xml:space="preserve">agent</w:t>
-      </w:r>
-      <w:r>
-        <w:t xml:space="preserve"> </w:t>
-      </w:r>
-      <w:r>
-        <w:t xml:space="preserve">is a software object that represents one thing in a system and decides what to do next from a small set of rules. An agent observes part of its surroundings, applies rules, and acts. Agents do not share a central program that decides everything; the behaviour of the whole system emerges from the agents interacting.</w:t>
+        <w:t xml:space="preserve">dispatch optimization</w:t>
+      </w:r>
+      <w:r>
+        <w:t xml:space="preserve">, not route optimization in the vehicle-routing sense. The dispatcher decides three things: which bin is served, which truck serves it, and in what order the queue is worked - fullest bin first, nearest free truck first. That decision is compared against the fixed-route baseline on three measures: total distance driven, waiting time before a bin is emptied, and overflow when a bin reaches 100 percent.</w:t>
       </w:r>
     </w:p>
     <w:p>
@@ -93,7 +89,7 @@
         <w:pStyle w:val="BodyText"/>
       </w:pPr>
       <w:r>
-        <w:t xml:space="preserve">A</w:t>
+        <w:t xml:space="preserve">No multi-stop route planning is performed. The smart strategy averages</w:t>
       </w:r>
       <w:r>
         <w:t xml:space="preserve"> </w:t>
@@ -103,21 +99,13 @@
           <w:b/>
           <w:bCs/>
         </w:rPr>
-        <w:t xml:space="preserve">multi-agent system</w:t>
+        <w:t xml:space="preserve">1.00 bins per trip</w:t>
       </w:r>
       <w:r>
         <w:t xml:space="preserve"> </w:t>
       </w:r>
       <w:r>
-        <w:t xml:space="preserve">is a collection of agents in a shared environment. Each agent has its own state and its own view. There is no global controller that computes the answer and hands it down. In this project the agents are bins, trucks and a dispatcher; they share a city grid and a queue of work.</w:t>
-      </w:r>
-    </w:p>
-    <w:p>
-      <w:pPr>
-        <w:pStyle w:val="BodyText"/>
-      </w:pPr>
-      <w:r>
-        <w:t xml:space="preserve">The agents are</w:t>
+        <w:t xml:space="preserve">at the reference load, against</w:t>
       </w:r>
       <w:r>
         <w:t xml:space="preserve"> </w:t>
@@ -127,20 +115,24 @@
           <w:b/>
           <w:bCs/>
         </w:rPr>
-        <w:t xml:space="preserve">rule-based</w:t>
-      </w:r>
-      <w:r>
-        <w:t xml:space="preserve">. Every decision is a written rule over numbers: a bin asks for a collection when it crosses 90 units, a truck takes what fits, the dispatcher picks the fullest bin and sends the nearest free truck. No machine learning is used anywhere. This matters for the results. When a number in this report moves, it moves because a rule changed, and the rule can be read in the source.</w:t>
-      </w:r>
-    </w:p>
+        <w:t xml:space="preserve">1.07 ± 0.05</w:t>
+      </w:r>
+      <w:r>
+        <w:t xml:space="preserve"> </w:t>
+      </w:r>
+      <w:r>
+        <w:t xml:space="preserve">for the baseline, because a truck holds 20 units and a bin at the 90 unit collection threshold offers exactly one full load. One visit fills the truck, so there is never a choice between chaining several bins into one trip and going straight to the depot. The savings this report measures come from not driving at all when no bin needs emptying, not from sequencing a tour more cleverly. Multi-stop routing with larger trucks, where a single trip could serve several bins in an order chosen for distance, is future work and is listed as such in the conclusion.</w:t>
+      </w:r>
+    </w:p>
+    <w:bookmarkEnd w:id="10"/>
     <w:bookmarkEnd w:id="11"/>
-    <w:bookmarkStart w:id="12" w:name="system-design"/>
+    <w:bookmarkStart w:id="12" w:name="background"/>
     <w:p>
       <w:pPr>
         <w:pStyle w:val="Heading2"/>
       </w:pPr>
       <w:r>
-        <w:t xml:space="preserve">3. System design</w:t>
+        <w:t xml:space="preserve">2. Background</w:t>
       </w:r>
     </w:p>
     <w:p>
@@ -148,54 +140,133 @@
         <w:pStyle w:val="FirstParagraph"/>
       </w:pPr>
       <w:r>
-        <w:t xml:space="preserve">Three agent types interact. Each observes, decides and acts differently.</w:t>
-      </w:r>
-    </w:p>
-    <w:p>
-      <w:pPr>
-        <w:pStyle w:val="BodyText"/>
-      </w:pPr>
+        <w:t xml:space="preserve">An</w:t>
+      </w:r>
+      <w:r>
+        <w:t xml:space="preserve"> </w:t>
+      </w:r>
       <w:r>
         <w:rPr>
           <w:b/>
           <w:bCs/>
         </w:rPr>
-        <w:t xml:space="preserve">Bin.</w:t>
+        <w:t xml:space="preserve">agent</w:t>
       </w:r>
       <w:r>
         <w:t xml:space="preserve"> </w:t>
       </w:r>
       <w:r>
-        <w:t xml:space="preserve">A bin observes the waste arriving into it each step and its own temperature. It decides when to ask for a collection, when to raise a safety alert, and when it has been emptied enough for the request to close. It holds one open request at a time and never raises a duplicate.</w:t>
+        <w:t xml:space="preserve">is a software object that represents one thing in a system and decides what to do next from a small set of rules. An agent observes part of its surroundings, applies rules, and acts. Agents do not share a central program that decides everything; the behaviour of the whole system emerges from the agents interacting.</w:t>
       </w:r>
     </w:p>
     <w:p>
       <w:pPr>
         <w:pStyle w:val="BodyText"/>
       </w:pPr>
+      <w:r>
+        <w:t xml:space="preserve">A</w:t>
+      </w:r>
+      <w:r>
+        <w:t xml:space="preserve"> </w:t>
+      </w:r>
       <w:r>
         <w:rPr>
           <w:b/>
           <w:bCs/>
         </w:rPr>
-        <w:t xml:space="preserve">Collector (truck).</w:t>
+        <w:t xml:space="preserve">multi-agent system</w:t>
       </w:r>
       <w:r>
         <w:t xml:space="preserve"> </w:t>
       </w:r>
       <w:r>
-        <w:t xml:space="preserve">A truck observes its own position, how full it is, and which bin it was sent to. It decides whether to drive on, to stop and load, or to return to the depot and unload. It carries 20 units and takes only what fits, so a bin holding more than the truck can carry is partly emptied and keeps the rest.</w:t>
+        <w:t xml:space="preserve">is a collection of agents in a shared environment. Each agent has its own state and its own view. There is no global controller that computes the answer and hands it down. In this project the agents are bins, trucks and a dispatcher; they share a city grid and a queue of work.</w:t>
       </w:r>
     </w:p>
     <w:p>
       <w:pPr>
         <w:pStyle w:val="BodyText"/>
       </w:pPr>
+      <w:r>
+        <w:t xml:space="preserve">The agents are</w:t>
+      </w:r>
+      <w:r>
+        <w:t xml:space="preserve"> </w:t>
+      </w:r>
       <w:r>
         <w:rPr>
           <w:b/>
           <w:bCs/>
         </w:rPr>
+        <w:t xml:space="preserve">rule-based</w:t>
+      </w:r>
+      <w:r>
+        <w:t xml:space="preserve">. Every decision is a written rule over numbers: a bin asks for a collection when it crosses 90 units, a truck takes what fits, the dispatcher picks the fullest bin and sends the nearest free truck. No machine learning is used anywhere. This matters for the results. When a number in this report moves, it moves because a rule changed, and the rule can be read in the source.</w:t>
+      </w:r>
+    </w:p>
+    <w:bookmarkEnd w:id="12"/>
+    <w:bookmarkStart w:id="13" w:name="system-design"/>
+    <w:p>
+      <w:pPr>
+        <w:pStyle w:val="Heading2"/>
+      </w:pPr>
+      <w:r>
+        <w:t xml:space="preserve">3. System design</w:t>
+      </w:r>
+    </w:p>
+    <w:p>
+      <w:pPr>
+        <w:pStyle w:val="FirstParagraph"/>
+      </w:pPr>
+      <w:r>
+        <w:t xml:space="preserve">Three agent types interact. Each observes, decides and acts differently.</w:t>
+      </w:r>
+    </w:p>
+    <w:p>
+      <w:pPr>
+        <w:pStyle w:val="BodyText"/>
+      </w:pPr>
+      <w:r>
+        <w:rPr>
+          <w:b/>
+          <w:bCs/>
+        </w:rPr>
+        <w:t xml:space="preserve">Bin.</w:t>
+      </w:r>
+      <w:r>
+        <w:t xml:space="preserve"> </w:t>
+      </w:r>
+      <w:r>
+        <w:t xml:space="preserve">A bin observes the waste arriving into it each step and its own temperature. It decides when to ask for a collection, when to raise a safety alert, and when it has been emptied enough for the request to close. It holds one open request at a time and never raises a duplicate.</w:t>
+      </w:r>
+    </w:p>
+    <w:p>
+      <w:pPr>
+        <w:pStyle w:val="BodyText"/>
+      </w:pPr>
+      <w:r>
+        <w:rPr>
+          <w:b/>
+          <w:bCs/>
+        </w:rPr>
+        <w:t xml:space="preserve">Collector (truck).</w:t>
+      </w:r>
+      <w:r>
+        <w:t xml:space="preserve"> </w:t>
+      </w:r>
+      <w:r>
+        <w:t xml:space="preserve">A truck observes its own position, how full it is, and which bin it was sent to. It decides whether to drive on, to stop and load, or to return to the depot and unload. It carries 20 units and takes only what fits, so a bin holding more than the truck can carry is partly emptied and keeps the rest.</w:t>
+      </w:r>
+    </w:p>
+    <w:p>
+      <w:pPr>
+        <w:pStyle w:val="BodyText"/>
+      </w:pPr>
+      <w:r>
+        <w:rPr>
+          <w:b/>
+          <w:bCs/>
+        </w:rPr>
         <w:t xml:space="preserve">Dispatcher.</w:t>
       </w:r>
       <w:r>
@@ -566,8 +637,8 @@
         <w:t xml:space="preserve">Two safety rules apply to both strategies. A bin whose temperature rises above 45 degrees raises an alert, and no truck will empty a bin while that alert is on. The alert is a state of its own, separate from the collection request, and it clears itself five steps after it was raised. A truck that is sent to a bin releases the job if the bin raises an alert, or if the bin is emptied by somebody else before the truck arrives, rather than driving on for a pickup that would collect nothing.</w:t>
       </w:r>
     </w:p>
-    <w:bookmarkEnd w:id="12"/>
-    <w:bookmarkStart w:id="13" w:name="implementation"/>
+    <w:bookmarkEnd w:id="13"/>
+    <w:bookmarkStart w:id="14" w:name="implementation"/>
     <w:p>
       <w:pPr>
         <w:pStyle w:val="Heading2"/>
@@ -924,8 +995,8 @@
         <w:t xml:space="preserve">A temperature above 45 degrees raises a safety alert that stops any truck emptying that bin, and the alert clears itself after five steps. This models a safety team that must make the bin safe before a truck can approach it. The same rule applies to both strategies, so it does not bias the comparison.</w:t>
       </w:r>
     </w:p>
-    <w:bookmarkEnd w:id="13"/>
-    <w:bookmarkStart w:id="14" w:name="experiment-setup"/>
+    <w:bookmarkEnd w:id="14"/>
+    <w:bookmarkStart w:id="15" w:name="experiment-setup"/>
     <w:p>
       <w:pPr>
         <w:pStyle w:val="Heading2"/>
@@ -1630,8 +1701,8 @@
         <w:t xml:space="preserve">Nothing may be lost and nothing may appear. The tolerance is 0.25 units, which covers the two decimals the bin levels are stored with. The largest gap seen across all 420 runs is 0.05 units.</w:t>
       </w:r>
     </w:p>
-    <w:bookmarkEnd w:id="14"/>
-    <w:bookmarkStart w:id="42" w:name="results"/>
+    <w:bookmarkEnd w:id="15"/>
+    <w:bookmarkStart w:id="43" w:name="results"/>
     <w:p>
       <w:pPr>
         <w:pStyle w:val="Heading2"/>
@@ -1640,7 +1711,7 @@
         <w:t xml:space="preserve">6. Results</w:t>
       </w:r>
     </w:p>
-    <w:bookmarkStart w:id="15" w:name="the-reference-load"/>
+    <w:bookmarkStart w:id="16" w:name="the-reference-load"/>
     <w:p>
       <w:pPr>
         <w:pStyle w:val="Heading3"/>
@@ -2602,8 +2673,8 @@
         <w:t xml:space="preserve">The estimate describes the baseline almost exactly, because the baseline is the strategy that never idles. It overstates the dispatcher by 49 percent, because the dispatcher deliberately waits until a bin crosses 90 units. The estimate is a capacity figure, not a prediction of what the dispatcher collects.</w:t>
       </w:r>
     </w:p>
-    <w:bookmarkEnd w:id="15"/>
-    <w:bookmarkStart w:id="40" w:name="the-load-sweep"/>
+    <w:bookmarkEnd w:id="16"/>
+    <w:bookmarkStart w:id="41" w:name="the-load-sweep"/>
     <w:p>
       <w:pPr>
         <w:pStyle w:val="Heading3"/>
@@ -3994,7 +4065,7 @@
         <w:t xml:space="preserve">The baseline drives 1,401.75 to 1,426.45 cells at every load level, because it drives its full route whatever happens. The dispatcher drives between 71.90 and 740.45 cells, rising with the waste, because it only leaves the depot when a bin is worth the trip.</w:t>
       </w:r>
     </w:p>
-    <w:bookmarkStart w:id="19" w:name="fig:overflow"/>
+    <w:bookmarkStart w:id="20" w:name="fig:overflow"/>
     <w:p>
       <w:pPr>
         <w:pStyle w:val="CaptionedFigure"/>
@@ -4004,18 +4075,18 @@
           <wp:inline>
             <wp:extent cx="5334000" cy="2667000"/>
             <wp:effectExtent b="0" l="0" r="0" t="0"/>
-            <wp:docPr descr="Overflow episodes by load level, for both strategies and the no-collection lower bound. Mean and standard deviation over 20 scenarios. The three ext levels were added after the first sweep." title="" id="17" name="Picture"/>
+            <wp:docPr descr="Overflow episodes by load level, for both strategies and the no-collection lower bound. Mean and standard deviation over 20 scenarios. The three ext levels were added after the first sweep." title="" id="18" name="Picture"/>
             <a:graphic>
               <a:graphicData uri="http://schemas.openxmlformats.org/drawingml/2006/picture">
                 <pic:pic>
                   <pic:nvPicPr>
-                    <pic:cNvPr descr="chart_overflow_episodes.png" id="18" name="Picture"/>
+                    <pic:cNvPr descr="chart_overflow_episodes.png" id="19" name="Picture"/>
                     <pic:cNvPicPr>
                       <a:picLocks noChangeArrowheads="1" noChangeAspect="1"/>
                     </pic:cNvPicPr>
                   </pic:nvPicPr>
                   <pic:blipFill>
-                    <a:blip r:embed="rId16"/>
+                    <a:blip r:embed="rId17"/>
                     <a:stretch>
                       <a:fillRect/>
                     </a:stretch>
@@ -4050,8 +4121,8 @@
         <w:t xml:space="preserve">Overflow episodes by load level, for both strategies and the no-collection lower bound. Mean and standard deviation over 20 scenarios. The three ext levels were added after the first sweep.</w:t>
       </w:r>
     </w:p>
-    <w:bookmarkEnd w:id="19"/>
-    <w:bookmarkStart w:id="23" w:name="fig:uncontained"/>
+    <w:bookmarkEnd w:id="20"/>
+    <w:bookmarkStart w:id="24" w:name="fig:uncontained"/>
     <w:p>
       <w:pPr>
         <w:pStyle w:val="CaptionedFigure"/>
@@ -4061,18 +4132,18 @@
           <wp:inline>
             <wp:extent cx="5334000" cy="2667000"/>
             <wp:effectExtent b="0" l="0" r="0" t="0"/>
-            <wp:docPr descr="Uncontained waste by load level: waste that no longer fitted into a full bin and stayed on the street." title="" id="21" name="Picture"/>
+            <wp:docPr descr="Uncontained waste by load level: waste that no longer fitted into a full bin and stayed on the street." title="" id="22" name="Picture"/>
             <a:graphic>
               <a:graphicData uri="http://schemas.openxmlformats.org/drawingml/2006/picture">
                 <pic:pic>
                   <pic:nvPicPr>
-                    <pic:cNvPr descr="chart_uncontained_waste.png" id="22" name="Picture"/>
+                    <pic:cNvPr descr="chart_uncontained_waste.png" id="23" name="Picture"/>
                     <pic:cNvPicPr>
                       <a:picLocks noChangeArrowheads="1" noChangeAspect="1"/>
                     </pic:cNvPicPr>
                   </pic:nvPicPr>
                   <pic:blipFill>
-                    <a:blip r:embed="rId20"/>
+                    <a:blip r:embed="rId21"/>
                     <a:stretch>
                       <a:fillRect/>
                     </a:stretch>
@@ -4107,8 +4178,8 @@
         <w:t xml:space="preserve">Uncontained waste by load level: waste that no longer fitted into a full bin and stayed on the street.</w:t>
       </w:r>
     </w:p>
-    <w:bookmarkEnd w:id="23"/>
-    <w:bookmarkStart w:id="27" w:name="fig:distance"/>
+    <w:bookmarkEnd w:id="24"/>
+    <w:bookmarkStart w:id="28" w:name="fig:distance"/>
     <w:p>
       <w:pPr>
         <w:pStyle w:val="CaptionedFigure"/>
@@ -4118,18 +4189,18 @@
           <wp:inline>
             <wp:extent cx="5334000" cy="2667000"/>
             <wp:effectExtent b="0" l="0" r="0" t="0"/>
-            <wp:docPr descr="Total distance driven by all trucks, by load level." title="" id="25" name="Picture"/>
+            <wp:docPr descr="Total distance driven by all trucks, by load level." title="" id="26" name="Picture"/>
             <a:graphic>
               <a:graphicData uri="http://schemas.openxmlformats.org/drawingml/2006/picture">
                 <pic:pic>
                   <pic:nvPicPr>
-                    <pic:cNvPr descr="chart_total_distance.png" id="26" name="Picture"/>
+                    <pic:cNvPr descr="chart_total_distance.png" id="27" name="Picture"/>
                     <pic:cNvPicPr>
                       <a:picLocks noChangeArrowheads="1" noChangeAspect="1"/>
                     </pic:cNvPicPr>
                   </pic:nvPicPr>
                   <pic:blipFill>
-                    <a:blip r:embed="rId24"/>
+                    <a:blip r:embed="rId25"/>
                     <a:stretch>
                       <a:fillRect/>
                     </a:stretch>
@@ -4164,8 +4235,8 @@
         <w:t xml:space="preserve">Total distance driven by all trucks, by load level.</w:t>
       </w:r>
     </w:p>
-    <w:bookmarkEnd w:id="27"/>
-    <w:bookmarkStart w:id="31" w:name="fig:wait"/>
+    <w:bookmarkEnd w:id="28"/>
+    <w:bookmarkStart w:id="32" w:name="fig:wait"/>
     <w:p>
       <w:pPr>
         <w:pStyle w:val="CaptionedFigure"/>
@@ -4175,18 +4246,18 @@
           <wp:inline>
             <wp:extent cx="5334000" cy="2667000"/>
             <wp:effectExtent b="0" l="0" r="0" t="0"/>
-            <wp:docPr descr="Average wait over served requests, by load level." title="" id="29" name="Picture"/>
+            <wp:docPr descr="Average wait over served requests, by load level." title="" id="30" name="Picture"/>
             <a:graphic>
               <a:graphicData uri="http://schemas.openxmlformats.org/drawingml/2006/picture">
                 <pic:pic>
                   <pic:nvPicPr>
-                    <pic:cNvPr descr="chart_avg_waiting_completed.png" id="30" name="Picture"/>
+                    <pic:cNvPr descr="chart_avg_waiting_completed.png" id="31" name="Picture"/>
                     <pic:cNvPicPr>
                       <a:picLocks noChangeArrowheads="1" noChangeAspect="1"/>
                     </pic:cNvPicPr>
                   </pic:nvPicPr>
                   <pic:blipFill>
-                    <a:blip r:embed="rId28"/>
+                    <a:blip r:embed="rId29"/>
                     <a:stretch>
                       <a:fillRect/>
                     </a:stretch>
@@ -4221,8 +4292,8 @@
         <w:t xml:space="preserve">Average wait over served requests, by load level.</w:t>
       </w:r>
     </w:p>
-    <w:bookmarkEnd w:id="31"/>
-    <w:bookmarkStart w:id="35" w:name="fig:unserved"/>
+    <w:bookmarkEnd w:id="32"/>
+    <w:bookmarkStart w:id="36" w:name="fig:unserved"/>
     <w:p>
       <w:pPr>
         <w:pStyle w:val="CaptionedFigure"/>
@@ -4232,18 +4303,18 @@
           <wp:inline>
             <wp:extent cx="5334000" cy="2667000"/>
             <wp:effectExtent b="0" l="0" r="0" t="0"/>
-            <wp:docPr descr="Unserved requests still open at the end of the day, by load level." title="" id="33" name="Picture"/>
+            <wp:docPr descr="Unserved requests still open at the end of the day, by load level." title="" id="34" name="Picture"/>
             <a:graphic>
               <a:graphicData uri="http://schemas.openxmlformats.org/drawingml/2006/picture">
                 <pic:pic>
                   <pic:nvPicPr>
-                    <pic:cNvPr descr="chart_unserved_requests.png" id="34" name="Picture"/>
+                    <pic:cNvPr descr="chart_unserved_requests.png" id="35" name="Picture"/>
                     <pic:cNvPicPr>
                       <a:picLocks noChangeArrowheads="1" noChangeAspect="1"/>
                     </pic:cNvPicPr>
                   </pic:nvPicPr>
                   <pic:blipFill>
-                    <a:blip r:embed="rId32"/>
+                    <a:blip r:embed="rId33"/>
                     <a:stretch>
                       <a:fillRect/>
                     </a:stretch>
@@ -4278,8 +4349,8 @@
         <w:t xml:space="preserve">Unserved requests still open at the end of the day, by load level.</w:t>
       </w:r>
     </w:p>
-    <w:bookmarkEnd w:id="35"/>
-    <w:bookmarkStart w:id="39" w:name="fig:utilisation"/>
+    <w:bookmarkEnd w:id="36"/>
+    <w:bookmarkStart w:id="40" w:name="fig:utilisation"/>
     <w:p>
       <w:pPr>
         <w:pStyle w:val="CaptionedFigure"/>
@@ -4289,18 +4360,18 @@
           <wp:inline>
             <wp:extent cx="5334000" cy="2667000"/>
             <wp:effectExtent b="0" l="0" r="0" t="0"/>
-            <wp:docPr descr="Truck utilisation by load level: the share of the day each truck was not idle." title="" id="37" name="Picture"/>
+            <wp:docPr descr="Truck utilisation by load level: the share of the day each truck was not idle." title="" id="38" name="Picture"/>
             <a:graphic>
               <a:graphicData uri="http://schemas.openxmlformats.org/drawingml/2006/picture">
                 <pic:pic>
                   <pic:nvPicPr>
-                    <pic:cNvPr descr="chart_truck_utilisation.png" id="38" name="Picture"/>
+                    <pic:cNvPr descr="chart_truck_utilisation.png" id="39" name="Picture"/>
                     <pic:cNvPicPr>
                       <a:picLocks noChangeArrowheads="1" noChangeAspect="1"/>
                     </pic:cNvPicPr>
                   </pic:nvPicPr>
                   <pic:blipFill>
-                    <a:blip r:embed="rId36"/>
+                    <a:blip r:embed="rId37"/>
                     <a:stretch>
                       <a:fillRect/>
                     </a:stretch>
@@ -4335,7 +4406,7 @@
         <w:t xml:space="preserve">Truck utilisation by load level: the share of the day each truck was not idle.</w:t>
       </w:r>
     </w:p>
-    <w:bookmarkEnd w:id="39"/>
+    <w:bookmarkEnd w:id="40"/>
     <w:p>
       <w:pPr>
         <w:pStyle w:val="BodyText"/>
@@ -4399,8 +4470,8 @@
         <w:t xml:space="preserve">A bin of this city sits 10.0 cells from the depot on average. At the reference load, the bins still waiting under the baseline sit 10.81 cells away and those still waiting under the dispatcher sit 9.77 cells away. The dispatcher does not leave the outskirts behind.</w:t>
       </w:r>
     </w:p>
-    <w:bookmarkEnd w:id="40"/>
-    <w:bookmarkStart w:id="41" w:name="the-duration-sweep"/>
+    <w:bookmarkEnd w:id="41"/>
+    <w:bookmarkStart w:id="42" w:name="the-duration-sweep"/>
     <w:p>
       <w:pPr>
         <w:pStyle w:val="Heading3"/>
@@ -5321,9 +5392,9 @@
         <w:t xml:space="preserve">Utilisation climbs with duration at every load level. At 130 percent the dispatcher is busy 0.51 of the first day, 0.84 by the third and 0.92 by the sixth. The clean one-day result is partly a fleet that has not yet come under pressure.</w:t>
       </w:r>
     </w:p>
-    <w:bookmarkEnd w:id="41"/>
     <w:bookmarkEnd w:id="42"/>
-    <w:bookmarkStart w:id="43" w:name="discussion"/>
+    <w:bookmarkEnd w:id="43"/>
+    <w:bookmarkStart w:id="44" w:name="discussion"/>
     <w:p>
       <w:pPr>
         <w:pStyle w:val="Heading2"/>
@@ -5440,8 +5511,8 @@
         <w:t xml:space="preserve">.</w:t>
       </w:r>
     </w:p>
-    <w:bookmarkEnd w:id="43"/>
-    <w:bookmarkStart w:id="44" w:name="assumptions-and-limitations"/>
+    <w:bookmarkEnd w:id="44"/>
+    <w:bookmarkStart w:id="45" w:name="assumptions-and-limitations"/>
     <w:p>
       <w:pPr>
         <w:pStyle w:val="Heading2"/>
@@ -5702,8 +5773,8 @@
         <w:t xml:space="preserve">Every bin gets busier at the same time. Real peaks hit some streets and not others.</w:t>
       </w:r>
     </w:p>
-    <w:bookmarkEnd w:id="44"/>
-    <w:bookmarkStart w:id="45" w:name="conclusion-and-future-work"/>
+    <w:bookmarkEnd w:id="45"/>
+    <w:bookmarkStart w:id="46" w:name="conclusion-and-future-work"/>
     <w:p>
       <w:pPr>
         <w:pStyle w:val="Heading2"/>
@@ -5717,33 +5788,28 @@
         <w:pStyle w:val="FirstParagraph"/>
       </w:pPr>
       <w:r>
-        <w:t xml:space="preserve">The system was built and measured. Over one day at 40 to 130 percent of a never-idle capacity estimate, the dispatcher causes no overflow and no uncontained waste, drives about half as far as the fixed route, and cuts the average wait from 43.23 steps to 8.07. Under sustained high load, over three or six days, it overflows more often than the fixed route and leaves a larger backlog. The fixed route wins on unserved requests and on bins per trip, but both of those metrics reward indiscriminate emptying rather than urgent service. The never-idle capacity estimate describes the baseline almost exactly and overstates the dispatcher by 49 percent, because a dispatcher that waits is not operating at capacity.</w:t>
-      </w:r>
-    </w:p>
-    <w:p>
-      <w:pPr>
-        <w:pStyle w:val="BodyText"/>
-      </w:pPr>
-      <w:r>
-        <w:t xml:space="preserve">Three pieces of future work follow directly from the results.</w:t>
-      </w:r>
-    </w:p>
-    <w:p>
-      <w:pPr>
-        <w:pStyle w:val="BodyText"/>
-      </w:pPr>
+        <w:t xml:space="preserve">The system was built and measured. The optimization tested was</w:t>
+      </w:r>
+      <w:r>
+        <w:t xml:space="preserve"> </w:t>
+      </w:r>
       <w:r>
         <w:rPr>
           <w:b/>
           <w:bCs/>
         </w:rPr>
-        <w:t xml:space="preserve">Lower the collection threshold as a test of the overflow explanation.</w:t>
-      </w:r>
-      <w:r>
-        <w:t xml:space="preserve"> </w:t>
-      </w:r>
-      <w:r>
-        <w:t xml:space="preserve">Section 7 offers a likely explanation for the reversal under sustained load: the dispatcher ignores any bin below 90 units, so under heavy load the threshold stops discriminating between urgent and non-urgent bins. Lowering the request threshold from 90 to, say, 70 would give the dispatcher more frequent, smaller jobs and let it rotate across the city more evenly. If the explanation is right, overflow episodes under sustained high load should fall relative to the baseline. If they do not, the explanation is wrong and the cause is elsewhere. This experiment is cheap to run with the existing sweep, and it turns a conjecture into a testable claim.</w:t>
+        <w:t xml:space="preserve">dispatch optimization</w:t>
+      </w:r>
+      <w:r>
+        <w:t xml:space="preserve">: which bin is served, by which truck, and in what order, against a fixed-route baseline. Over one day at 40 to 130 percent of a never-idle capacity estimate, the dispatcher causes no overflow and no uncontained waste, drives about half as far as the fixed route, and cuts the average wait from 43.23 steps to 8.07. Under sustained high load, over three or six days, it overflows more often than the fixed route and leaves a larger backlog. The fixed route wins on unserved requests and on bins per trip, but both of those metrics reward indiscriminate emptying rather than urgent service. The never-idle capacity estimate describes the baseline almost exactly and overstates the dispatcher by 49 percent, because a dispatcher that waits is not operating at capacity.</w:t>
+      </w:r>
+    </w:p>
+    <w:p>
+      <w:pPr>
+        <w:pStyle w:val="BodyText"/>
+      </w:pPr>
+      <w:r>
+        <w:t xml:space="preserve">Four pieces of future work follow directly from the results.</w:t>
       </w:r>
     </w:p>
     <w:p>
@@ -5755,13 +5821,13 @@
           <w:b/>
           <w:bCs/>
         </w:rPr>
-        <w:t xml:space="preserve">Implement a tuned-frequency baseline.</w:t>
+        <w:t xml:space="preserve">Extend the work from dispatch to route optimization.</w:t>
       </w:r>
       <w:r>
         <w:t xml:space="preserve"> </w:t>
       </w:r>
       <w:r>
-        <w:t xml:space="preserve">The current baseline empties bins that never asked, which costs it capacity and flatters its unserved-request count. A baseline that varies how often each bin is visited, for example by ordering its fixed route by how fast each bin fills, would be a much stronger opponent. Any claim that dispatching pays should survive against that version.</w:t>
+        <w:t xml:space="preserve">Section 1 states the scope: what was tested is dispatch optimization, and a trip covers 1.00 bins because one bin fills a 20 unit truck. A truck large enough to carry several full pickups would make multi-stop route planning possible, and the order in which it chains those bins could be optimised for distance rather than for fullness. That is the missing half of the title, and it needs a different truck capacity, a different objective and a different metric, because bins per trip would stop being pinned at 1.00.</w:t>
       </w:r>
     </w:p>
     <w:p>
@@ -5773,6 +5839,42 @@
           <w:b/>
           <w:bCs/>
         </w:rPr>
+        <w:t xml:space="preserve">Lower the collection threshold as a test of the overflow explanation.</w:t>
+      </w:r>
+      <w:r>
+        <w:t xml:space="preserve"> </w:t>
+      </w:r>
+      <w:r>
+        <w:t xml:space="preserve">Section 7 offers a likely explanation for the reversal under sustained load: the dispatcher ignores any bin below 90 units, so under heavy load the threshold stops discriminating between urgent and non-urgent bins. Lowering the request threshold from 90 to, say, 70 would give the dispatcher more frequent, smaller jobs and let it rotate across the city more evenly. If the explanation is right, overflow episodes under sustained high load should fall relative to the baseline. If they do not, the explanation is wrong and the cause is elsewhere. This experiment is cheap to run with the existing sweep, and it turns a conjecture into a testable claim.</w:t>
+      </w:r>
+    </w:p>
+    <w:p>
+      <w:pPr>
+        <w:pStyle w:val="BodyText"/>
+      </w:pPr>
+      <w:r>
+        <w:rPr>
+          <w:b/>
+          <w:bCs/>
+        </w:rPr>
+        <w:t xml:space="preserve">Implement a tuned-frequency baseline.</w:t>
+      </w:r>
+      <w:r>
+        <w:t xml:space="preserve"> </w:t>
+      </w:r>
+      <w:r>
+        <w:t xml:space="preserve">The current baseline empties bins that never asked, which costs it capacity and flatters its unserved-request count. A baseline that varies how often each bin is visited, for example by ordering its fixed route by how fast each bin fills, would be a much stronger opponent. Any claim that dispatching pays should survive against that version.</w:t>
+      </w:r>
+    </w:p>
+    <w:p>
+      <w:pPr>
+        <w:pStyle w:val="BodyText"/>
+      </w:pPr>
+      <w:r>
+        <w:rPr>
+          <w:b/>
+          <w:bCs/>
+        </w:rPr>
         <w:t xml:space="preserve">Add a second dispatch policy.</w:t>
       </w:r>
       <w:r>
@@ -5782,8 +5884,8 @@
         <w:t xml:space="preserve">For example, serving the bin that has waited longest rather than the fullest one. The two policies differ in what they optimise, and comparing them would show whether the priority rule itself is doing the work or whether the savings come only from not driving when nothing is needed.</w:t>
       </w:r>
     </w:p>
-    <w:bookmarkEnd w:id="45"/>
-    <w:bookmarkStart w:id="67" w:name="appendix"/>
+    <w:bookmarkEnd w:id="46"/>
+    <w:bookmarkStart w:id="68" w:name="appendix"/>
     <w:p>
       <w:pPr>
         <w:pStyle w:val="Heading2"/>
@@ -5792,7 +5894,7 @@
         <w:t xml:space="preserve">10. Appendix</w:t>
       </w:r>
     </w:p>
-    <w:bookmarkStart w:id="46" w:name="running-the-project-locally"/>
+    <w:bookmarkStart w:id="47" w:name="running-the-project-locally"/>
     <w:p>
       <w:pPr>
         <w:pStyle w:val="Heading3"/>
@@ -5871,8 +5973,8 @@
         <w:t xml:space="preserve">and the chart images to populate its Results tab. If they are missing, that tab shows a warning instead of crashing.</w:t>
       </w:r>
     </w:p>
-    <w:bookmarkEnd w:id="46"/>
-    <w:bookmarkStart w:id="49" w:name="links"/>
+    <w:bookmarkEnd w:id="47"/>
+    <w:bookmarkStart w:id="50" w:name="links"/>
     <w:p>
       <w:pPr>
         <w:pStyle w:val="Heading3"/>
@@ -5895,7 +5997,7 @@
       <w:r>
         <w:t xml:space="preserve"> </w:t>
       </w:r>
-      <w:hyperlink r:id="rId47">
+      <w:hyperlink r:id="rId48">
         <w:r>
           <w:rPr>
             <w:rStyle w:val="Hyperlink"/>
@@ -5918,7 +6020,7 @@
       <w:r>
         <w:t xml:space="preserve"> </w:t>
       </w:r>
-      <w:hyperlink r:id="rId48">
+      <w:hyperlink r:id="rId49">
         <w:r>
           <w:rPr>
             <w:rStyle w:val="Hyperlink"/>
@@ -5927,8 +6029,8 @@
         </w:r>
       </w:hyperlink>
     </w:p>
-    <w:bookmarkEnd w:id="49"/>
-    <w:bookmarkStart w:id="66" w:name="screenshots"/>
+    <w:bookmarkEnd w:id="50"/>
+    <w:bookmarkStart w:id="67" w:name="screenshots"/>
     <w:p>
       <w:pPr>
         <w:pStyle w:val="Heading3"/>
@@ -5947,7 +6049,7 @@
       <w:r>
         <w:t xml:space="preserve"> </w:t>
       </w:r>
-      <w:hyperlink r:id="rId47">
+      <w:hyperlink r:id="rId48">
         <w:r>
           <w:rPr>
             <w:rStyle w:val="Hyperlink"/>
@@ -5959,7 +6061,7 @@
         <w:t xml:space="preserve">.</w:t>
       </w:r>
     </w:p>
-    <w:bookmarkStart w:id="53" w:name="fig:shot-smart"/>
+    <w:bookmarkStart w:id="54" w:name="fig:shot-smart"/>
     <w:p>
       <w:pPr>
         <w:pStyle w:val="CaptionedFigure"/>
@@ -5969,18 +6071,18 @@
           <wp:inline>
             <wp:extent cx="5334000" cy="5334000"/>
             <wp:effectExtent b="0" l="0" r="0" t="0"/>
-            <wp:docPr descr="The Simulation tab in the Smart view: bins coloured and marked by state, the legend under the grid naming every state, and truck 2 parked on the outlined depot at the start of the day." title="" id="51" name="Picture"/>
+            <wp:docPr descr="The Simulation tab in the Smart view: bins coloured and marked by state, the legend under the grid naming every state, and truck 2 parked on the outlined depot at the start of the day." title="" id="52" name="Picture"/>
             <a:graphic>
               <a:graphicData uri="http://schemas.openxmlformats.org/drawingml/2006/picture">
                 <pic:pic>
                   <pic:nvPicPr>
-                    <pic:cNvPr descr="screenshots/Screenshot_20261015_080240_Mises.png" id="52" name="Picture"/>
+                    <pic:cNvPr descr="screenshots/Screenshot_20261015_080240_Mises.png" id="53" name="Picture"/>
                     <pic:cNvPicPr>
                       <a:picLocks noChangeArrowheads="1" noChangeAspect="1"/>
                     </pic:cNvPicPr>
                   </pic:nvPicPr>
                   <pic:blipFill>
-                    <a:blip r:embed="rId50"/>
+                    <a:blip r:embed="rId51"/>
                     <a:stretch>
                       <a:fillRect/>
                     </a:stretch>
@@ -6015,8 +6117,8 @@
         <w:t xml:space="preserve">The Simulation tab in the Smart view: bins coloured and marked by state, the legend under the grid naming every state, and truck 2 parked on the outlined depot at the start of the day.</w:t>
       </w:r>
     </w:p>
-    <w:bookmarkEnd w:id="53"/>
-    <w:bookmarkStart w:id="57" w:name="fig:shot-baseline"/>
+    <w:bookmarkEnd w:id="54"/>
+    <w:bookmarkStart w:id="58" w:name="fig:shot-baseline"/>
     <w:p>
       <w:pPr>
         <w:pStyle w:val="CaptionedFigure"/>
@@ -6026,18 +6128,18 @@
           <wp:inline>
             <wp:extent cx="5334000" cy="5326591"/>
             <wp:effectExtent b="0" l="0" r="0" t="0"/>
-            <wp:docPr descr="The same city at the same step under the Baseline strategy. Only the truck differs: truck 3 sits on the depot, because the baseline follows a fixed route rather than answering requests." title="" id="55" name="Picture"/>
+            <wp:docPr descr="The same city at the same step under the Baseline strategy. Only the truck differs: truck 3 sits on the depot, because the baseline follows a fixed route rather than answering requests." title="" id="56" name="Picture"/>
             <a:graphic>
               <a:graphicData uri="http://schemas.openxmlformats.org/drawingml/2006/picture">
                 <pic:pic>
                   <pic:nvPicPr>
-                    <pic:cNvPr descr="screenshots/Screenshot_20261015_080252_Mises.png" id="56" name="Picture"/>
+                    <pic:cNvPr descr="screenshots/Screenshot_20261015_080252_Mises.png" id="57" name="Picture"/>
                     <pic:cNvPicPr>
                       <a:picLocks noChangeArrowheads="1" noChangeAspect="1"/>
                     </pic:cNvPicPr>
                   </pic:nvPicPr>
                   <pic:blipFill>
-                    <a:blip r:embed="rId54"/>
+                    <a:blip r:embed="rId55"/>
                     <a:stretch>
                       <a:fillRect/>
                     </a:stretch>
@@ -6072,8 +6174,8 @@
         <w:t xml:space="preserve">The same city at the same step under the Baseline strategy. Only the truck differs: truck 3 sits on the depot, because the baseline follows a fixed route rather than answering requests.</w:t>
       </w:r>
     </w:p>
-    <w:bookmarkEnd w:id="57"/>
-    <w:bookmarkStart w:id="61" w:name="fig:shot-tables"/>
+    <w:bookmarkEnd w:id="58"/>
+    <w:bookmarkStart w:id="62" w:name="fig:shot-tables"/>
     <w:p>
       <w:pPr>
         <w:pStyle w:val="CaptionedFigure"/>
@@ -6083,18 +6185,18 @@
           <wp:inline>
             <wp:extent cx="5334000" cy="4133850"/>
             <wp:effectExtent b="0" l="0" r="0" t="0"/>
-            <wp:docPr descr="The tables below the map at step 0: the five headline metrics all read zero, the fill levels are listed fullest first, and the request queue and collection history show their empty states." title="" id="59" name="Picture"/>
+            <wp:docPr descr="The tables below the map at step 0: the five headline metrics all read zero, the fill levels are listed fullest first, and the request queue and collection history show their empty states." title="" id="60" name="Picture"/>
             <a:graphic>
               <a:graphicData uri="http://schemas.openxmlformats.org/drawingml/2006/picture">
                 <pic:pic>
                   <pic:nvPicPr>
-                    <pic:cNvPr descr="screenshots/Screenshot_20261015_080301_Mises.png" id="60" name="Picture"/>
+                    <pic:cNvPr descr="screenshots/Screenshot_20261015_080301_Mises.png" id="61" name="Picture"/>
                     <pic:cNvPicPr>
                       <a:picLocks noChangeArrowheads="1" noChangeAspect="1"/>
                     </pic:cNvPicPr>
                   </pic:nvPicPr>
                   <pic:blipFill>
-                    <a:blip r:embed="rId58"/>
+                    <a:blip r:embed="rId59"/>
                     <a:stretch>
                       <a:fillRect/>
                     </a:stretch>
@@ -6129,8 +6231,8 @@
         <w:t xml:space="preserve">The tables below the map at step 0: the five headline metrics all read zero, the fill levels are listed fullest first, and the request queue and collection history show their empty states.</w:t>
       </w:r>
     </w:p>
-    <w:bookmarkEnd w:id="61"/>
-    <w:bookmarkStart w:id="65" w:name="fig:shot-results"/>
+    <w:bookmarkEnd w:id="62"/>
+    <w:bookmarkStart w:id="66" w:name="fig:shot-results"/>
     <w:p>
       <w:pPr>
         <w:pStyle w:val="CaptionedFigure"/>
@@ -6140,18 +6242,18 @@
           <wp:inline>
             <wp:extent cx="5334000" cy="5463645"/>
             <wp:effectExtent b="0" l="0" r="0" t="0"/>
-            <wp:docPr descr="The Results tab with the overflow-episode chart: the dispatcher is clean up to the 130 % level and above the fixed route beyond it, with the duration sweep and the transient note in the collapsed panels below." title="" id="63" name="Picture"/>
+            <wp:docPr descr="The Results tab with the overflow-episode chart: the dispatcher is clean up to the 130 % level and above the fixed route beyond it, with the duration sweep and the transient note in the collapsed panels below." title="" id="64" name="Picture"/>
             <a:graphic>
               <a:graphicData uri="http://schemas.openxmlformats.org/drawingml/2006/picture">
                 <pic:pic>
                   <pic:nvPicPr>
-                    <pic:cNvPr descr="screenshots/Screenshot_20261015_080311_Mises.png" id="64" name="Picture"/>
+                    <pic:cNvPr descr="screenshots/Screenshot_20261015_080311_Mises.png" id="65" name="Picture"/>
                     <pic:cNvPicPr>
                       <a:picLocks noChangeArrowheads="1" noChangeAspect="1"/>
                     </pic:cNvPicPr>
                   </pic:nvPicPr>
                   <pic:blipFill>
-                    <a:blip r:embed="rId62"/>
+                    <a:blip r:embed="rId63"/>
                     <a:stretch>
                       <a:fillRect/>
                     </a:stretch>
@@ -6186,10 +6288,10 @@
         <w:t xml:space="preserve">The Results tab with the overflow-episode chart: the dispatcher is clean up to the 130 % level and above the fixed route beyond it, with the duration sweep and the transient note in the collapsed panels below.</w:t>
       </w:r>
     </w:p>
-    <w:bookmarkEnd w:id="65"/>
     <w:bookmarkEnd w:id="66"/>
     <w:bookmarkEnd w:id="67"/>
     <w:bookmarkEnd w:id="68"/>
+    <w:bookmarkEnd w:id="69"/>
     <w:sectPr>
       <w:footnotePr>
         <w:numRestart w:val="eachSect"/>

</xml_diff>